<commit_message>
Finalize JATM submission cleanup
</commit_message>
<xml_diff>
--- a/paper_revision_jatm/manuscript/JATM_Main_Manuscript_Anonymized.docx
+++ b/paper_revision_jatm/manuscript/JATM_Main_Manuscript_Anonymized.docx
@@ -1200,7 +1200,7 @@
                 <w:i w:val="0"/>
                 <w:sz w:val="14"/>
               </w:rPr>
-              <w:t>scenario count</w:t>
+              <w:t>Scenario count</w:t>
             </w:r>
           </w:p>
         </w:tc>
@@ -1234,7 +1234,7 @@
                 <w:i w:val="0"/>
                 <w:sz w:val="14"/>
               </w:rPr>
-              <w:t>mean readiness</w:t>
+              <w:t>Mean readiness</w:t>
             </w:r>
           </w:p>
         </w:tc>
@@ -1250,7 +1250,7 @@
                 <w:i w:val="0"/>
                 <w:sz w:val="14"/>
               </w:rPr>
-              <w:t>47.396</w:t>
+              <w:t>47.4</w:t>
             </w:r>
           </w:p>
         </w:tc>
@@ -1268,7 +1268,7 @@
                 <w:i w:val="0"/>
                 <w:sz w:val="14"/>
               </w:rPr>
-              <w:t>median readiness</w:t>
+              <w:t>Median readiness</w:t>
             </w:r>
           </w:p>
         </w:tc>
@@ -1302,7 +1302,7 @@
                 <w:i w:val="0"/>
                 <w:sz w:val="14"/>
               </w:rPr>
-              <w:t>mean action queue size</w:t>
+              <w:t>Mean action queue size</w:t>
             </w:r>
           </w:p>
         </w:tc>
@@ -1318,7 +1318,7 @@
                 <w:i w:val="0"/>
                 <w:sz w:val="14"/>
               </w:rPr>
-              <w:t>4.604</w:t>
+              <w:t>4.6</w:t>
             </w:r>
           </w:p>
         </w:tc>
@@ -1336,7 +1336,7 @@
                 <w:i w:val="0"/>
                 <w:sz w:val="14"/>
               </w:rPr>
-              <w:t>alert routine count</w:t>
+              <w:t>Routine alerts</w:t>
             </w:r>
           </w:p>
         </w:tc>
@@ -1370,7 +1370,7 @@
                 <w:i w:val="0"/>
                 <w:sz w:val="14"/>
               </w:rPr>
-              <w:t>alert watch count</w:t>
+              <w:t>Watch alerts</w:t>
             </w:r>
           </w:p>
         </w:tc>
@@ -1404,7 +1404,7 @@
                 <w:i w:val="0"/>
                 <w:sz w:val="14"/>
               </w:rPr>
-              <w:t>alert priority count</w:t>
+              <w:t>Priority alerts</w:t>
             </w:r>
           </w:p>
         </w:tc>
@@ -1438,7 +1438,7 @@
                 <w:i w:val="0"/>
                 <w:sz w:val="14"/>
               </w:rPr>
-              <w:t>alert critical count</w:t>
+              <w:t>Critical alerts</w:t>
             </w:r>
           </w:p>
         </w:tc>
@@ -1472,7 +1472,7 @@
                 <w:i w:val="0"/>
                 <w:sz w:val="14"/>
               </w:rPr>
-              <w:t>dominant bottleneck maintenance count</w:t>
+              <w:t>Maintenance bottleneck count</w:t>
             </w:r>
           </w:p>
         </w:tc>
@@ -1506,7 +1506,7 @@
                 <w:i w:val="0"/>
                 <w:sz w:val="14"/>
               </w:rPr>
-              <w:t>dominant bottleneck catering count</w:t>
+              <w:t>Catering bottleneck count</w:t>
             </w:r>
           </w:p>
         </w:tc>
@@ -1540,7 +1540,7 @@
                 <w:i w:val="0"/>
                 <w:sz w:val="14"/>
               </w:rPr>
-              <w:t>dominant bottleneck boarding count</w:t>
+              <w:t>Boarding bottleneck count</w:t>
             </w:r>
           </w:p>
         </w:tc>
@@ -2105,7 +2105,7 @@
                 <w:i w:val="0"/>
                 <w:sz w:val="14"/>
               </w:rPr>
-              <w:t>4.8</w:t>
+              <w:t>4.80</w:t>
             </w:r>
           </w:p>
         </w:tc>
@@ -2808,7 +2808,7 @@
                 <w:i w:val="0"/>
                 <w:sz w:val="14"/>
               </w:rPr>
-              <w:t>malfunction severity</w:t>
+              <w:t>Malfunction severity</w:t>
             </w:r>
           </w:p>
         </w:tc>
@@ -2824,7 +2824,7 @@
                 <w:i w:val="0"/>
                 <w:sz w:val="14"/>
               </w:rPr>
-              <w:t>False</w:t>
+              <w:t>No</w:t>
             </w:r>
           </w:p>
         </w:tc>
@@ -2858,7 +2858,7 @@
                 <w:i w:val="0"/>
                 <w:sz w:val="14"/>
               </w:rPr>
-              <w:t>malfunction count</w:t>
+              <w:t>Malfunction count</w:t>
             </w:r>
           </w:p>
         </w:tc>
@@ -2874,7 +2874,7 @@
                 <w:i w:val="0"/>
                 <w:sz w:val="14"/>
               </w:rPr>
-              <w:t>False</w:t>
+              <w:t>No</w:t>
             </w:r>
           </w:p>
         </w:tc>
@@ -2908,7 +2908,7 @@
                 <w:i w:val="0"/>
                 <w:sz w:val="14"/>
               </w:rPr>
-              <w:t>inventory shortage score</w:t>
+              <w:t>Inventory shortage score</w:t>
             </w:r>
           </w:p>
         </w:tc>
@@ -2924,7 +2924,7 @@
                 <w:i w:val="0"/>
                 <w:sz w:val="14"/>
               </w:rPr>
-              <w:t>True</w:t>
+              <w:t>Yes</w:t>
             </w:r>
           </w:p>
         </w:tc>
@@ -2958,7 +2958,7 @@
                 <w:i w:val="0"/>
                 <w:sz w:val="14"/>
               </w:rPr>
-              <w:t>trolley availability</w:t>
+              <w:t>Trolley availability</w:t>
             </w:r>
           </w:p>
         </w:tc>
@@ -2974,7 +2974,7 @@
                 <w:i w:val="0"/>
                 <w:sz w:val="14"/>
               </w:rPr>
-              <w:t>True</w:t>
+              <w:t>Yes</w:t>
             </w:r>
           </w:p>
         </w:tc>
@@ -3008,7 +3008,7 @@
                 <w:i w:val="0"/>
                 <w:sz w:val="14"/>
               </w:rPr>
-              <w:t>arrival delay</w:t>
+              <w:t>Arrival delay</w:t>
             </w:r>
           </w:p>
         </w:tc>
@@ -3024,7 +3024,7 @@
                 <w:i w:val="0"/>
                 <w:sz w:val="14"/>
               </w:rPr>
-              <w:t>True</w:t>
+              <w:t>Yes</w:t>
             </w:r>
           </w:p>
         </w:tc>
@@ -3058,7 +3058,7 @@
                 <w:i w:val="0"/>
                 <w:sz w:val="14"/>
               </w:rPr>
-              <w:t>gate congestion</w:t>
+              <w:t>Gate congestion</w:t>
             </w:r>
           </w:p>
         </w:tc>
@@ -3074,7 +3074,7 @@
                 <w:i w:val="0"/>
                 <w:sz w:val="14"/>
               </w:rPr>
-              <w:t>True</w:t>
+              <w:t>Yes</w:t>
             </w:r>
           </w:p>
         </w:tc>
@@ -3108,7 +3108,7 @@
                 <w:i w:val="0"/>
                 <w:sz w:val="14"/>
               </w:rPr>
-              <w:t>assistance request</w:t>
+              <w:t>Assistance request</w:t>
             </w:r>
           </w:p>
         </w:tc>
@@ -3124,7 +3124,7 @@
                 <w:i w:val="0"/>
                 <w:sz w:val="14"/>
               </w:rPr>
-              <w:t>True</w:t>
+              <w:t>Yes</w:t>
             </w:r>
           </w:p>
         </w:tc>
@@ -3158,7 +3158,7 @@
                 <w:i w:val="0"/>
                 <w:sz w:val="14"/>
               </w:rPr>
-              <w:t>composite vs low risk</w:t>
+              <w:t>Composite vs low risk</w:t>
             </w:r>
           </w:p>
         </w:tc>
@@ -3174,7 +3174,7 @@
                 <w:i w:val="0"/>
                 <w:sz w:val="14"/>
               </w:rPr>
-              <w:t>True</w:t>
+              <w:t>Yes</w:t>
             </w:r>
           </w:p>
         </w:tc>
@@ -3441,7 +3441,7 @@
                 <w:i w:val="0"/>
                 <w:sz w:val="14"/>
               </w:rPr>
-              <w:t>full system</w:t>
+              <w:t>Full system</w:t>
             </w:r>
           </w:p>
         </w:tc>
@@ -3457,7 +3457,7 @@
                 <w:i w:val="0"/>
                 <w:sz w:val="14"/>
               </w:rPr>
-              <w:t>47.396</w:t>
+              <w:t>47.4</w:t>
             </w:r>
           </w:p>
         </w:tc>
@@ -3521,7 +3521,7 @@
                 <w:i w:val="0"/>
                 <w:sz w:val="14"/>
               </w:rPr>
-              <w:t>4.604</w:t>
+              <w:t>4.6</w:t>
             </w:r>
           </w:p>
         </w:tc>
@@ -3555,7 +3555,7 @@
                 <w:i w:val="0"/>
                 <w:sz w:val="14"/>
               </w:rPr>
-              <w:t>no assistance in fusion</w:t>
+              <w:t>No assistance in fusion</w:t>
             </w:r>
           </w:p>
         </w:tc>
@@ -3571,7 +3571,7 @@
                 <w:i w:val="0"/>
                 <w:sz w:val="14"/>
               </w:rPr>
-              <w:t>48.828</w:t>
+              <w:t>48.83</w:t>
             </w:r>
           </w:p>
         </w:tc>
@@ -3587,7 +3587,7 @@
                 <w:i w:val="0"/>
                 <w:sz w:val="14"/>
               </w:rPr>
-              <w:t>1.432</w:t>
+              <w:t>1.43</w:t>
             </w:r>
           </w:p>
         </w:tc>
@@ -3635,7 +3635,7 @@
                 <w:i w:val="0"/>
                 <w:sz w:val="14"/>
               </w:rPr>
-              <w:t>4.415</w:t>
+              <w:t>4.42</w:t>
             </w:r>
           </w:p>
         </w:tc>
@@ -3669,7 +3669,7 @@
                 <w:i w:val="0"/>
                 <w:sz w:val="14"/>
               </w:rPr>
-              <w:t>no bottleneck in fusion</w:t>
+              <w:t>No bottleneck in fusion</w:t>
             </w:r>
           </w:p>
         </w:tc>
@@ -3685,7 +3685,7 @@
                 <w:i w:val="0"/>
                 <w:sz w:val="14"/>
               </w:rPr>
-              <w:t>57.388</w:t>
+              <w:t>57.39</w:t>
             </w:r>
           </w:p>
         </w:tc>
@@ -3701,7 +3701,7 @@
                 <w:i w:val="0"/>
                 <w:sz w:val="14"/>
               </w:rPr>
-              <w:t>9.991</w:t>
+              <w:t>9.99</w:t>
             </w:r>
           </w:p>
         </w:tc>
@@ -3749,7 +3749,7 @@
                 <w:i w:val="0"/>
                 <w:sz w:val="14"/>
               </w:rPr>
-              <w:t>4.657</w:t>
+              <w:t>4.66</w:t>
             </w:r>
           </w:p>
         </w:tc>
@@ -3783,7 +3783,7 @@
                 <w:i w:val="0"/>
                 <w:sz w:val="14"/>
               </w:rPr>
-              <w:t>no inventory in fusion</w:t>
+              <w:t>No inventory in fusion</w:t>
             </w:r>
           </w:p>
         </w:tc>
@@ -3815,7 +3815,7 @@
                 <w:i w:val="0"/>
                 <w:sz w:val="14"/>
               </w:rPr>
-              <w:t>6.734</w:t>
+              <w:t>6.73</w:t>
             </w:r>
           </w:p>
         </w:tc>
@@ -3863,7 +3863,7 @@
                 <w:i w:val="0"/>
                 <w:sz w:val="14"/>
               </w:rPr>
-              <w:t>4.071</w:t>
+              <w:t>4.07</w:t>
             </w:r>
           </w:p>
         </w:tc>
@@ -3897,7 +3897,7 @@
                 <w:i w:val="0"/>
                 <w:sz w:val="14"/>
               </w:rPr>
-              <w:t>no maintenance in fusion</w:t>
+              <w:t>No maintenance in fusion</w:t>
             </w:r>
           </w:p>
         </w:tc>
@@ -3913,7 +3913,7 @@
                 <w:i w:val="0"/>
                 <w:sz w:val="14"/>
               </w:rPr>
-              <w:t>61.049</w:t>
+              <w:t>61.05</w:t>
             </w:r>
           </w:p>
         </w:tc>
@@ -3929,7 +3929,7 @@
                 <w:i w:val="0"/>
                 <w:sz w:val="14"/>
               </w:rPr>
-              <w:t>13.652</w:t>
+              <w:t>13.65</w:t>
             </w:r>
           </w:p>
         </w:tc>
@@ -3977,7 +3977,7 @@
                 <w:i w:val="0"/>
                 <w:sz w:val="14"/>
               </w:rPr>
-              <w:t>3.938</w:t>
+              <w:t>3.94</w:t>
             </w:r>
           </w:p>
         </w:tc>
@@ -4239,7 +4239,7 @@
                 <w:i w:val="0"/>
                 <w:sz w:val="14"/>
               </w:rPr>
-              <w:t>static delay gate</w:t>
+              <w:t>Static delay/gate baseline</w:t>
             </w:r>
           </w:p>
         </w:tc>
@@ -4255,7 +4255,7 @@
                 <w:i w:val="0"/>
                 <w:sz w:val="14"/>
               </w:rPr>
-              <w:t>73.439</w:t>
+              <w:t>73.44</w:t>
             </w:r>
           </w:p>
         </w:tc>
@@ -4271,7 +4271,7 @@
                 <w:i w:val="0"/>
                 <w:sz w:val="14"/>
               </w:rPr>
-              <w:t>13.648</w:t>
+              <w:t>13.65</w:t>
             </w:r>
           </w:p>
         </w:tc>
@@ -4369,7 +4369,7 @@
                 <w:i w:val="0"/>
                 <w:sz w:val="14"/>
               </w:rPr>
-              <w:t>maintenance only</w:t>
+              <w:t>Maintenance-only baseline</w:t>
             </w:r>
           </w:p>
         </w:tc>
@@ -4385,7 +4385,7 @@
                 <w:i w:val="0"/>
                 <w:sz w:val="14"/>
               </w:rPr>
-              <w:t>73.556</w:t>
+              <w:t>73.56</w:t>
             </w:r>
           </w:p>
         </w:tc>
@@ -4401,7 +4401,7 @@
                 <w:i w:val="0"/>
                 <w:sz w:val="14"/>
               </w:rPr>
-              <w:t>23.758</w:t>
+              <w:t>23.76</w:t>
             </w:r>
           </w:p>
         </w:tc>
@@ -4499,7 +4499,7 @@
                 <w:i w:val="0"/>
                 <w:sz w:val="14"/>
               </w:rPr>
-              <w:t>inventory only</w:t>
+              <w:t>Inventory-only baseline</w:t>
             </w:r>
           </w:p>
         </w:tc>
@@ -4515,7 +4515,7 @@
                 <w:i w:val="0"/>
                 <w:sz w:val="14"/>
               </w:rPr>
-              <w:t>69.153</w:t>
+              <w:t>69.15</w:t>
             </w:r>
           </w:p>
         </w:tc>
@@ -4531,7 +4531,7 @@
                 <w:i w:val="0"/>
                 <w:sz w:val="14"/>
               </w:rPr>
-              <w:t>15.805</w:t>
+              <w:t>15.8</w:t>
             </w:r>
           </w:p>
         </w:tc>
@@ -4629,7 +4629,7 @@
                 <w:i w:val="0"/>
                 <w:sz w:val="14"/>
               </w:rPr>
-              <w:t>bottleneck only</w:t>
+              <w:t>Bottleneck-only baseline</w:t>
             </w:r>
           </w:p>
         </w:tc>
@@ -4645,7 +4645,7 @@
                 <w:i w:val="0"/>
                 <w:sz w:val="14"/>
               </w:rPr>
-              <w:t>50.183</w:t>
+              <w:t>50.18</w:t>
             </w:r>
           </w:p>
         </w:tc>
@@ -4759,7 +4759,7 @@
                 <w:i w:val="0"/>
                 <w:sz w:val="14"/>
               </w:rPr>
-              <w:t>full integrated occ fusion</w:t>
+              <w:t>Full integrated OCC fusion</w:t>
             </w:r>
           </w:p>
         </w:tc>
@@ -4775,7 +4775,7 @@
                 <w:i w:val="0"/>
                 <w:sz w:val="14"/>
               </w:rPr>
-              <w:t>47.396</w:t>
+              <w:t>47.4</w:t>
             </w:r>
           </w:p>
         </w:tc>
@@ -4791,7 +4791,7 @@
                 <w:i w:val="0"/>
                 <w:sz w:val="14"/>
               </w:rPr>
-              <w:t>25.038</w:t>
+              <w:t>25.04</w:t>
             </w:r>
           </w:p>
         </w:tc>
@@ -5079,7 +5079,7 @@
           <w:i w:val="0"/>
           <w:sz w:val="20"/>
         </w:rPr>
-        <w:t>The demonstrator source code, scenario-evaluation scripts, generated tables, and generated figures used in this study are available at https://github.com/purohit0208/intact-occ-decision-support-demonstrator. No airline operational dataset is included.</w:t>
+        <w:t>The demonstrator source code, scenario-evaluation scripts, generated tables, and generated figures used in this study are available in a repository prepared for review. The identifying repository link has been withheld from the anonymized manuscript and will be provided after peer review or through an anonymized review link if required by the journal workflow. No airline operational dataset is included.</w:t>
       </w:r>
     </w:p>
     <w:p>

</xml_diff>

<commit_message>
Polish JATM citations and blinded supplement
</commit_message>
<xml_diff>
--- a/paper_revision_jatm/manuscript/JATM_Main_Manuscript_Anonymized.docx
+++ b/paper_revision_jatm/manuscript/JATM_Main_Manuscript_Anonymized.docx
@@ -35,7 +35,7 @@
           <w:i w:val="0"/>
           <w:sz w:val="20"/>
         </w:rPr>
-        <w:t>Aircraft turnaround coordination depends on maintenance, catering, passenger-assistance, gate, and bottleneck information that may become available before arrival but is often handled through fragmented workflows. This paper presents a human-in-the-loop Operations Control Center (OCC) decision-support architecture for pre-arrival aircraft turnaround coordination. The architecture integrates component-aware maintenance risk indicators, service-area inventory readiness, process-class bottleneck forecasting, passenger-assistance readiness logic, and a transparent rule-based fusion layer that converts heterogeneous signals into readiness scores, alert levels, and operator-facing action queues. The evaluation is deliberately framed as controlled synthetic scenario analysis rather than airline deployment validation. Existing module-level holdout results are combined with a deterministic scenario sweep of 1000 synthetic inbound cases across six operational regimes, monotonicity and sanity checks, and ablation and baseline comparisons. The scenario sweep produced mean readiness 47.396, median readiness 50.65, 370 Critical cases, 284 Priority cases, and 188 Routine cases. Ablations show that removing maintenance influence increased mean readiness by 13.65 points, while removing bottleneck influence increased mean readiness by 9.99 points, indicating that the fusion layer materially changes prioritization under controlled stress conditions. Two maintenance-related monotonicity checks did not strictly pass because small local readiness increases occurred at low malfunction levels before urgency thresholds changed; these failures are treated as limitations of the current model-fusion interaction rather than hidden. The work contributes a reproducible OCC decision-support architecture and scenario-evaluation package, while explicitly preserving the limitations that no airline operational data, OCC user study, deployment, certification, or measured operational savings are claimed.</w:t>
+        <w:t>Aircraft turnaround coordination depends on maintenance, catering, passenger-assistance, gate, and bottleneck information that may become available before arrival but is often handled through fragmented workflows. This paper presents a human-in-the-loop Operations Control Center (OCC) decision-support architecture for pre-arrival aircraft turnaround coordination. The architecture integrates component-aware maintenance risk indicators, service-area inventory readiness, process-class bottleneck forecasting, passenger-assistance readiness logic, and a transparent rule-based fusion layer that converts heterogeneous signals into readiness scores, alert levels, and operator-facing action queues. The evaluation is deliberately framed as controlled synthetic scenario analysis rather than airline deployment validation. Existing module-level holdout results are combined with a deterministic scenario sweep of 1000 synthetic inbound cases across six operational regimes, monotonicity and sanity checks, and ablation and baseline comparisons. The scenario sweep produced mean readiness 47.4, median readiness 50.6, 370 Critical cases, 284 Priority cases, and 188 Routine cases. Ablations show that removing maintenance influence increased mean readiness by 13.7 points, while removing bottleneck influence increased mean readiness by 10.0 points, indicating that the fusion layer materially changes prioritization under controlled stress conditions. Two maintenance-related monotonicity checks did not strictly pass because small local readiness increases occurred at low malfunction levels before urgency thresholds changed; these failures are treated as limitations of the current model-fusion interaction rather than hidden. The work contributes a reproducible OCC decision-support architecture and scenario-evaluation package, while explicitly preserving the limitations that no airline operational data, OCC user study, deployment, certification, or measured operational savings are claimed.</w:t>
       </w:r>
     </w:p>
     <w:p>
@@ -129,7 +129,7 @@
           <w:i w:val="0"/>
           <w:sz w:val="20"/>
         </w:rPr>
-        <w:t>Airline Operations Control Centers coordinate time-critical decisions across aircraft, crews, gates, passengers, and downstream rotations. Classical OCC and disruption-management literature, including work by Clarke, Clausen, Hassan, and Su, shows that these decisions combine schedule recovery, resource coordination, and human judgment rather than a single optimization objective. Naturalistic and decision-support studies by Fogaca and Vink further motivate systems that preserve operator review instead of replacing OCC staff with automated control.</w:t>
+        <w:t>Airline Operations Control Centers coordinate time-critical decisions across aircraft, crews, gates, passengers, and downstream rotations. Classical OCC and disruption-management literature shows that these decisions combine schedule recovery, resource coordination, and human judgment rather than a single optimization objective (Clarke, 1998; Clausen et al., 2010; Hassan et al., 2021; Su et al., 2021). Naturalistic and decision-support studies further motivate systems that preserve operator review instead of replacing OCC staff with automated control (Vink et al., 2020; Fogaca et al., 2022).</w:t>
       </w:r>
     </w:p>
     <w:p>
@@ -151,7 +151,7 @@
           <w:i w:val="0"/>
           <w:sz w:val="20"/>
         </w:rPr>
-        <w:t>Aircraft turnaround research treats the stand-side process as a tightly coupled operational system. Work on turnaround management, ground-handling automation, apron-resource planning, and delay propagation, including studies by Makhloof, Conde, Gok, Guimarans, Evler, and Wu, shows that local process delays can affect broader airline and airport performance. This paper builds on that perspective by focusing on pre-arrival coordination signals that can change preparation before the aircraft reaches the stand.</w:t>
+        <w:t>Aircraft turnaround research treats the stand-side process as a tightly coupled operational system. Work on turnaround management, digital-twin support, apron-resource planning, ground-resource planning, schedule recovery, and ground-handling prediction shows that local process delays can affect broader airline and airport performance (Makhloof et al., 2014; Evler et al., 2021a, 2021b, 2022; Conde et al., 2022; Guimarans and Padron, 2022; Gok et al., 2023; Wu et al., 2023). This paper builds on that perspective by focusing on pre-arrival coordination signals that can change preparation before the aircraft reaches the stand.</w:t>
       </w:r>
     </w:p>
     <w:p>
@@ -173,7 +173,7 @@
           <w:i w:val="0"/>
           <w:sz w:val="20"/>
         </w:rPr>
-        <w:t>Aviation machine-learning studies have addressed arrival-time prediction, delay classification, resource planning, and ground-operation forecasting. The cited studies by Basturk, Zoutendijk, Sahadevan, Okwir, Kicinger, and Wandelt support the view that predictive analytics can inform aviation operations. However, a collection of separate predictive tasks does not automatically create an OCC workflow. The contribution here is therefore not a new prediction algorithm; it is the operational integration of heterogeneous predictive and rule-based signals into one pre-arrival advisory process.</w:t>
+        <w:t>Aviation machine-learning studies have addressed arrival-time prediction, delay classification, resource planning, smart-aviation applications, and ground-operation forecasting (Basturk and Cetek, 2021; Zoutendijk and Mitici, 2021; Sahadevan et al., 2023; Jiang et al., 2023; Okwir et al., 2025; Kicinger et al., 2025; Wandelt et al., 2025). However, a collection of separate predictive tasks does not automatically create an OCC workflow. The contribution here is therefore not a new prediction algorithm; it is the operational integration of heterogeneous predictive and rule-based signals into one pre-arrival advisory process.</w:t>
       </w:r>
     </w:p>
     <w:p>
@@ -195,7 +195,7 @@
           <w:i w:val="0"/>
           <w:sz w:val="20"/>
         </w:rPr>
-        <w:t>Predictive-maintenance studies by Dangut, Lee and Mitici, Zeng, Hakami, and Kabashkin motivate maintenance-risk indicators for aviation decision support. Adjacent work on food-service and demand forecasting, including Malefors and Rodrigues, is relevant to service-readiness reasoning, but it should not be interpreted as evidence for item-wise airline trolley-demand prediction in this paper. Passenger-assistance and accessibility work by Gotti and Lee motivates explicit assistance-readiness handling, while the implemented system treats assistance as rule-based readiness support rather than localization machine learning.</w:t>
+        <w:t>Predictive-maintenance studies motivate maintenance-risk indicators for aviation decision support (Dangut et al., 2022, 2023; Lee and Mitici, 2023; Zeng and Liang, 2023; Hakami, 2024; Kabashkin and Shoshin, 2024). Adjacent work on food-service and demand forecasting is relevant to service-readiness reasoning, but it should not be interpreted as evidence for item-wise airline trolley-demand prediction in this paper (Malefors et al., 2022; Rodrigues et al., 2024). Passenger-assistance and accessibility studies motivate explicit assistance-readiness handling, while the implemented system treats assistance as rule-based readiness support rather than localization machine learning (Gotti et al., 2024; Lee et al., 2025).</w:t>
       </w:r>
     </w:p>
     <w:p>
@@ -217,7 +217,7 @@
           <w:i w:val="0"/>
           <w:sz w:val="20"/>
         </w:rPr>
-        <w:t>Human-in-the-loop AI and explainability work, including Mosqueira-Rey, Vaccaro, and Xie, supports transparent advisory systems where model outputs remain reviewable by human operators. Synthetic-data and scenario-evaluation studies by Ardebili, de Frutos, and Stefani provide a methodological basis for controlled evaluation when operational data are not available, but they do not remove the need for future airline data and user studies. This paper therefore uses synthetic scenarios to evaluate architecture behavior, not to claim field validity.</w:t>
+        <w:t>Human-in-the-loop AI and explainability work supports transparent advisory systems where model outputs remain reviewable by human operators (Xie et al., 2021; Mosqueira-Rey et al., 2023; Vaccaro et al., 2024). Synthetic-data and scenario-evaluation studies provide a methodological basis for controlled evaluation when operational data are not available, but they do not remove the need for future airline data and user studies (Ardebili et al., 2023; de Frutos Carro et al., 2024; Stefani et al., 2025). This paper therefore uses synthetic scenarios to evaluate architecture behavior, not to claim field validity.</w:t>
       </w:r>
     </w:p>
     <w:p>
@@ -5079,7 +5079,7 @@
           <w:i w:val="0"/>
           <w:sz w:val="20"/>
         </w:rPr>
-        <w:t>The demonstrator source code, scenario-evaluation scripts, generated tables, and generated figures used in this study are available in a repository prepared for review. The identifying repository link has been withheld from the anonymized manuscript and will be provided after peer review or through an anonymized review link if required by the journal workflow. No airline operational dataset is included.</w:t>
+        <w:t>The scenario-evaluation scripts, generated tables, and generated figures used in this study are provided as a blinded supplementary archive for peer review. The identifying public repository link has been withheld from the anonymized manuscript and is provided only in the non-anonymized title-page material. No airline operational dataset is included.</w:t>
       </w:r>
     </w:p>
     <w:p>

</xml_diff>

<commit_message>
Fix JATM table count formatting
</commit_message>
<xml_diff>
--- a/paper_revision_jatm/manuscript/JATM_Main_Manuscript_Anonymized.docx
+++ b/paper_revision_jatm/manuscript/JATM_Main_Manuscript_Anonymized.docx
@@ -1216,7 +1216,7 @@
                 <w:i w:val="0"/>
                 <w:sz w:val="14"/>
               </w:rPr>
-              <w:t>1000.0</w:t>
+              <w:t>1000</w:t>
             </w:r>
           </w:p>
         </w:tc>
@@ -1250,7 +1250,7 @@
                 <w:i w:val="0"/>
                 <w:sz w:val="14"/>
               </w:rPr>
-              <w:t>47.4</w:t>
+              <w:t>47.40</w:t>
             </w:r>
           </w:p>
         </w:tc>
@@ -1318,7 +1318,7 @@
                 <w:i w:val="0"/>
                 <w:sz w:val="14"/>
               </w:rPr>
-              <w:t>4.6</w:t>
+              <w:t>4.60</w:t>
             </w:r>
           </w:p>
         </w:tc>
@@ -1352,7 +1352,7 @@
                 <w:i w:val="0"/>
                 <w:sz w:val="14"/>
               </w:rPr>
-              <w:t>188.0</w:t>
+              <w:t>188</w:t>
             </w:r>
           </w:p>
         </w:tc>
@@ -1386,7 +1386,7 @@
                 <w:i w:val="0"/>
                 <w:sz w:val="14"/>
               </w:rPr>
-              <w:t>158.0</w:t>
+              <w:t>158</w:t>
             </w:r>
           </w:p>
         </w:tc>
@@ -1420,7 +1420,7 @@
                 <w:i w:val="0"/>
                 <w:sz w:val="14"/>
               </w:rPr>
-              <w:t>284.0</w:t>
+              <w:t>284</w:t>
             </w:r>
           </w:p>
         </w:tc>
@@ -1454,7 +1454,7 @@
                 <w:i w:val="0"/>
                 <w:sz w:val="14"/>
               </w:rPr>
-              <w:t>370.0</w:t>
+              <w:t>370</w:t>
             </w:r>
           </w:p>
         </w:tc>
@@ -1488,7 +1488,7 @@
                 <w:i w:val="0"/>
                 <w:sz w:val="14"/>
               </w:rPr>
-              <w:t>319.0</w:t>
+              <w:t>319</w:t>
             </w:r>
           </w:p>
         </w:tc>
@@ -1522,7 +1522,7 @@
                 <w:i w:val="0"/>
                 <w:sz w:val="14"/>
               </w:rPr>
-              <w:t>186.0</w:t>
+              <w:t>186</w:t>
             </w:r>
           </w:p>
         </w:tc>
@@ -1556,7 +1556,7 @@
                 <w:i w:val="0"/>
                 <w:sz w:val="14"/>
               </w:rPr>
-              <w:t>286.0</w:t>
+              <w:t>286</w:t>
             </w:r>
           </w:p>
         </w:tc>
@@ -1911,7 +1911,7 @@
                 <w:i w:val="0"/>
                 <w:sz w:val="14"/>
               </w:rPr>
-              <w:t>65.5</w:t>
+              <w:t>65.50</w:t>
             </w:r>
           </w:p>
         </w:tc>
@@ -2041,7 +2041,7 @@
                 <w:i w:val="0"/>
                 <w:sz w:val="14"/>
               </w:rPr>
-              <w:t>5.0</w:t>
+              <w:t>5.00</w:t>
             </w:r>
           </w:p>
         </w:tc>
@@ -2171,7 +2171,7 @@
                 <w:i w:val="0"/>
                 <w:sz w:val="14"/>
               </w:rPr>
-              <w:t>46.4</w:t>
+              <w:t>46.40</w:t>
             </w:r>
           </w:p>
         </w:tc>
@@ -2301,7 +2301,7 @@
                 <w:i w:val="0"/>
                 <w:sz w:val="14"/>
               </w:rPr>
-              <w:t>56.2</w:t>
+              <w:t>56.20</w:t>
             </w:r>
           </w:p>
         </w:tc>
@@ -2431,7 +2431,7 @@
                 <w:i w:val="0"/>
                 <w:sz w:val="14"/>
               </w:rPr>
-              <w:t>82.4</w:t>
+              <w:t>82.40</w:t>
             </w:r>
           </w:p>
         </w:tc>
@@ -2479,7 +2479,7 @@
                 <w:i w:val="0"/>
                 <w:sz w:val="14"/>
               </w:rPr>
-              <w:t>0.2</w:t>
+              <w:t>0.200</w:t>
             </w:r>
           </w:p>
         </w:tc>
@@ -2561,7 +2561,7 @@
                 <w:i w:val="0"/>
                 <w:sz w:val="14"/>
               </w:rPr>
-              <w:t>26.6</w:t>
+              <w:t>26.60</w:t>
             </w:r>
           </w:p>
         </w:tc>
@@ -3457,7 +3457,7 @@
                 <w:i w:val="0"/>
                 <w:sz w:val="14"/>
               </w:rPr>
-              <w:t>47.4</w:t>
+              <w:t>47.40</w:t>
             </w:r>
           </w:p>
         </w:tc>
@@ -3473,7 +3473,7 @@
                 <w:i w:val="0"/>
                 <w:sz w:val="14"/>
               </w:rPr>
-              <w:t>0.0</w:t>
+              <w:t>0.00</w:t>
             </w:r>
           </w:p>
         </w:tc>
@@ -3521,7 +3521,7 @@
                 <w:i w:val="0"/>
                 <w:sz w:val="14"/>
               </w:rPr>
-              <w:t>4.6</w:t>
+              <w:t>4.60</w:t>
             </w:r>
           </w:p>
         </w:tc>
@@ -4531,7 +4531,7 @@
                 <w:i w:val="0"/>
                 <w:sz w:val="14"/>
               </w:rPr>
-              <w:t>15.8</w:t>
+              <w:t>15.80</w:t>
             </w:r>
           </w:p>
         </w:tc>
@@ -4775,7 +4775,7 @@
                 <w:i w:val="0"/>
                 <w:sz w:val="14"/>
               </w:rPr>
-              <w:t>47.4</w:t>
+              <w:t>47.40</w:t>
             </w:r>
           </w:p>
         </w:tc>

</xml_diff>